<commit_message>
Update EU REACH certificate templates with user's new 1-page design
</commit_message>
<xml_diff>
--- a/templates/source/EU_REACH_SOURCE.docx
+++ b/templates/source/EU_REACH_SOURCE.docx
@@ -249,17 +249,7 @@
                                   <w:color w:val="2D2D2D"/>
                                   <w:sz w:val="27"/>
                                 </w:rPr>
-                                <w:t xml:space="preserve">Ami </w:t>
-                              </w:r>
-                              <w:r>
-                                <w:rPr>
-                                  <w:rFonts w:ascii="Verdana" w:hAnsi="Verdana"/>
-                                  <w:b/>
-                                  <w:color w:val="2D2D2D"/>
-                                  <w:spacing w:val="-2"/>
-                                  <w:sz w:val="27"/>
-                                </w:rPr>
-                                <w:t>Pharma</w:t>
+                                <w:t>{{COMPANY_NAME}}</w:t>
                               </w:r>
                             </w:p>
                             <w:p>
@@ -277,7 +267,7 @@
                                   <w:color w:val="596472"/>
                                   <w:sz w:val="18"/>
                                 </w:rPr>
-                                <w:t xml:space="preserve">C-1/394, Phase II, G.I.D.C. Estate, Vatva, Ahmedabad: 382445, </w:t>
+                                <w:t xml:space="preserve">{{ADDR_LINE1}} </w:t>
                               </w:r>
                               <w:r>
                                 <w:rPr>
@@ -286,7 +276,7 @@
                                   <w:spacing w:val="-2"/>
                                   <w:sz w:val="18"/>
                                 </w:rPr>
-                                <w:t>India</w:t>
+                                <w:t>{{ADDR_LINE3}}</w:t>
                               </w:r>
                             </w:p>
                             <w:p>
@@ -399,17 +389,7 @@
                             <w:color w:val="2D2D2D"/>
                             <w:sz w:val="27"/>
                           </w:rPr>
-                          <w:t xml:space="preserve">Ami </w:t>
-                        </w:r>
-                        <w:r>
-                          <w:rPr>
-                            <w:rFonts w:ascii="Verdana" w:hAnsi="Verdana"/>
-                            <w:b/>
-                            <w:color w:val="2D2D2D"/>
-                            <w:spacing w:val="-2"/>
-                            <w:sz w:val="27"/>
-                          </w:rPr>
-                          <w:t>Pharma</w:t>
+                          <w:t>{{COMPANY_NAME}}</w:t>
                         </w:r>
                       </w:p>
                       <w:p>
@@ -427,7 +407,7 @@
                             <w:color w:val="596472"/>
                             <w:sz w:val="18"/>
                           </w:rPr>
-                          <w:t xml:space="preserve">C-1/394, Phase II, G.I.D.C. Estate, Vatva, Ahmedabad: 382445, </w:t>
+                          <w:t xml:space="preserve">{{ADDR_LINE1}} </w:t>
                         </w:r>
                         <w:r>
                           <w:rPr>
@@ -436,7 +416,7 @@
                             <w:spacing w:val="-2"/>
                             <w:sz w:val="18"/>
                           </w:rPr>
-                          <w:t>India</w:t>
+                          <w:t>{{ADDR_LINE3}}</w:t>
                         </w:r>
                       </w:p>
                       <w:p>
@@ -724,17 +704,7 @@
                 <w:sz w:val="20"/>
                 <w:szCs w:val="20"/>
               </w:rPr>
-              <w:t xml:space="preserve">29H,31H-phthalocyaninato(2-)-N29,N30,N31,N32 </w:t>
-            </w:r>
-            <w:r>
-              <w:rPr>
-                <w:rFonts w:ascii="Verdana" w:hAnsi="Verdana"/>
-                <w:color w:val="2D2D2D"/>
-                <w:spacing w:val="-2"/>
-                <w:sz w:val="20"/>
-                <w:szCs w:val="20"/>
-              </w:rPr>
-              <w:t>copper</w:t>
+              <w:t>{{CHEMICAL_NAME}}</w:t>
             </w:r>
           </w:p>
         </w:tc>
@@ -826,17 +796,7 @@
                 <w:sz w:val="20"/>
                 <w:szCs w:val="20"/>
               </w:rPr>
-              <w:t>147-14-</w:t>
-            </w:r>
-            <w:r>
-              <w:rPr>
-                <w:rFonts w:ascii="Verdana" w:hAnsi="Verdana"/>
-                <w:color w:val="2D2D2D"/>
-                <w:spacing w:val="-10"/>
-                <w:sz w:val="20"/>
-                <w:szCs w:val="20"/>
-              </w:rPr>
-              <w:t>8</w:t>
+              <w:t>{{CAS_NUMBER}}</w:t>
             </w:r>
           </w:p>
         </w:tc>
@@ -929,17 +889,7 @@
                 <w:sz w:val="20"/>
                 <w:szCs w:val="20"/>
               </w:rPr>
-              <w:t>205-685-</w:t>
-            </w:r>
-            <w:r>
-              <w:rPr>
-                <w:rFonts w:ascii="Verdana" w:hAnsi="Verdana"/>
-                <w:color w:val="2D2D2D"/>
-                <w:spacing w:val="-10"/>
-                <w:sz w:val="20"/>
-                <w:szCs w:val="20"/>
-              </w:rPr>
-              <w:t>1</w:t>
+              <w:t>{{EC_NUMBER}}</w:t>
             </w:r>
           </w:p>
         </w:tc>
@@ -1030,17 +980,7 @@
                 <w:sz w:val="20"/>
                 <w:szCs w:val="20"/>
               </w:rPr>
-              <w:t xml:space="preserve">10–100 </w:t>
-            </w:r>
-            <w:r>
-              <w:rPr>
-                <w:rFonts w:ascii="Verdana" w:hAnsi="Verdana"/>
-                <w:color w:val="2D2D2D"/>
-                <w:spacing w:val="-5"/>
-                <w:sz w:val="20"/>
-                <w:szCs w:val="20"/>
-              </w:rPr>
-              <w:t>tpa</w:t>
+              <w:t>{{TONNAGE_BAND}}</w:t>
             </w:r>
           </w:p>
         </w:tc>
@@ -1194,7 +1134,7 @@
                                   </w14:solidFill>
                                 </w14:textFill>
                               </w:rPr>
-                              <w:t>01-2119458771-32-0109</w:t>
+                              <w:t>{{REGISTRATION_NUMBER}}</w:t>
                             </w:r>
                           </w:p>
                         </w:txbxContent>
@@ -1282,7 +1222,7 @@
                             </w14:solidFill>
                           </w14:textFill>
                         </w:rPr>
-                        <w:t>01-2119458771-32-0109</w:t>
+                        <w:t>{{REGISTRATION_NUMBER}}</w:t>
                       </w:r>
                     </w:p>
                   </w:txbxContent>
@@ -1458,17 +1398,7 @@
                                 <w:sz w:val="20"/>
                                 <w:szCs w:val="20"/>
                               </w:rPr>
-                              <w:t>ECHA-ac4a5f61-f070-4d66-9703-</w:t>
-                            </w:r>
-                            <w:r>
-                              <w:rPr>
-                                <w:rFonts w:ascii="Verdana" w:hAnsi="Verdana"/>
-                                <w:color w:val="FFFFFF"/>
-                                <w:spacing w:val="-2"/>
-                                <w:sz w:val="20"/>
-                                <w:szCs w:val="20"/>
-                              </w:rPr>
-                              <w:t>96b2190cb5ba</w:t>
+                              <w:t>{{UUID_NUMBER}}</w:t>
                             </w:r>
                           </w:p>
                           <w:p>
@@ -1595,17 +1525,7 @@
                           <w:sz w:val="20"/>
                           <w:szCs w:val="20"/>
                         </w:rPr>
-                        <w:t>ECHA-ac4a5f61-f070-4d66-9703-</w:t>
-                      </w:r>
-                      <w:r>
-                        <w:rPr>
-                          <w:rFonts w:ascii="Verdana" w:hAnsi="Verdana"/>
-                          <w:color w:val="FFFFFF"/>
-                          <w:spacing w:val="-2"/>
-                          <w:sz w:val="20"/>
-                          <w:szCs w:val="20"/>
-                        </w:rPr>
-                        <w:t>96b2190cb5ba</w:t>
+                        <w:t>{{UUID_NUMBER}}</w:t>
                       </w:r>
                     </w:p>
                     <w:p>
@@ -1944,7 +1864,7 @@
                                   <w:color w:val="2D2D2D"/>
                                   <w:sz w:val="22"/>
                                 </w:rPr>
-                                <w:t xml:space="preserve">1 January 2026 </w:t>
+                                <w:t xml:space="preserve">{{ISSUED_DATE}} </w:t>
                               </w:r>
                             </w:p>
                           </w:txbxContent>
@@ -2019,7 +1939,7 @@
                                   <w:color w:val="BF382A"/>
                                   <w:sz w:val="22"/>
                                 </w:rPr>
-                                <w:t>31 December 2026</w:t>
+                                <w:t>{{VALIDATED_DATE}}</w:t>
                               </w:r>
                             </w:p>
                           </w:txbxContent>
@@ -2110,7 +2030,7 @@
                             <w:color w:val="2D2D2D"/>
                             <w:sz w:val="22"/>
                           </w:rPr>
-                          <w:t xml:space="preserve">1 January 2026 </w:t>
+                          <w:t xml:space="preserve">{{ISSUED_DATE}} </w:t>
                         </w:r>
                       </w:p>
                     </w:txbxContent>
@@ -2175,7 +2095,7 @@
                             <w:color w:val="BF382A"/>
                             <w:sz w:val="22"/>
                           </w:rPr>
-                          <w:t>31 December 2026</w:t>
+                          <w:t>{{VALIDATED_DATE}}</w:t>
                         </w:r>
                       </w:p>
                     </w:txbxContent>

</xml_diff>